<commit_message>
Major UI redesign: modern purple/teal theme + landing page + Meshulam payment links
</commit_message>
<xml_diff>
--- a/save_data/דוח GPT - רומי פישמן - 14041986.docx
+++ b/save_data/דוח GPT - רומי פישמן - 14041986.docx
@@ -4,11 +4,11 @@
   <w:body>
     <w:p>
       <w:pPr>
-        <w:pStyle w:val="Heading1"/>
+        <w:pStyle w:val="Title"/>
         <w:jc w:val="right"/>
       </w:pPr>
       <w:r>
-        <w:t>דוח GPT נומרולוגי עבור: רומי פישמן</w:t>
+        <w:t>דוח נומרולוגי עבור: רומי פישמן</w:t>
       </w:r>
     </w:p>
     <w:p>
@@ -16,8 +16,1254 @@
         <w:jc w:val="right"/>
       </w:pPr>
       <w:r>
-        <w:t>כדי להגשים את הייעוד שלך, רומי, עליך להתמקד בשיתוף פעולה עם אחרים ולפתח קשרים חברתיים משמעותיים. המסלול שלך מצביע על צורך בתמיכה ובאהבה, ולכן חשוב שתשקול להצטרף לקבוצות או לקהילות שבהן תוכל לתרום את הכישורים שלך ולקבל תמיכה. בשנה אישית 9, אתה נמצא בשלב של סיום והשלמה, ולכן כדאי להיפרד מהדברים שאינם משרתים אותך יותר, ולפנות מקום לדברים חדשים שיכולים להיכנס לחייך. זהו זמן מצוין להתפתחות אישית ורוחנית, ולכן כדאי להקדיש זמן לפעילויות שמזינות את הנשמה שלך, כמו מדיטציה, קריאה או חקר תחומי עניין חדשים. חשוב גם לשמור על גמישות ונכונות לשינויים, כי הם חלק מהתהליך.</w:t>
+        <w:t>תאריך לידה: 14041986</w:t>
       </w:r>
+    </w:p>
+    <w:p>
+      <w:pPr>
+        <w:jc w:val="right"/>
+      </w:pPr>
+      <w:r>
+        <w:t>מין: נקבה</w:t>
+      </w:r>
+    </w:p>
+    <w:p>
+      <w:pPr>
+        <w:jc w:val="right"/>
+      </w:pPr>
+      <w:r>
+        <w:t>תאריך הפקת הדוח: 19/05/2025</w:t>
+      </w:r>
+    </w:p>
+    <w:p>
+      <w:pPr>
+        <w:jc w:val="right"/>
+      </w:pPr>
+    </w:p>
+    <w:p>
+      <w:pPr>
+        <w:pStyle w:val="Heading1"/>
+        <w:jc w:val="right"/>
+      </w:pPr>
+      <w:r>
+        <w:t>מספר ייעוד (דרך חיים)</w:t>
+      </w:r>
+    </w:p>
+    <w:p>
+      <w:pPr>
+        <w:jc w:val="right"/>
+      </w:pPr>
+      <w:r>
+        <w:t>המספר המחושב: 6 (סכום ספרות מקורי: 33)</w:t>
+      </w:r>
+    </w:p>
+    <w:p>
+      <w:pPr>
+        <w:jc w:val="right"/>
+      </w:pPr>
+      <w:r>
+        <w:t>﻿אופי:</w:t>
+        <w:br/>
+        <w:t>תדר של אהבה והרמוניה, זרימה וקלילות.</w:t>
+        <w:br/>
+        <w:t>יופי ומשפחה.</w:t>
+        <w:br/>
+        <w:t>נטייה רוחנית חזקה, יכולות ריפוי גבוהות.</w:t>
+        <w:br/>
+        <w:t>אחריות ומסירות לקרוביה עד כדי דאגנות יתר.</w:t>
+        <w:br/>
+        <w:t>שאיפה לשרת את הציבור בשלום ובענווה.</w:t>
+        <w:br/>
+        <w:t>חיה את החיים בעומק רגשי בלתי רגיל.</w:t>
+        <w:br/>
+        <w:t>במקום בו מקבלת חיבה ואהבה,</w:t>
+        <w:br/>
+        <w:t>מתפתחת בה מלוא העוצמה שלה.</w:t>
+        <w:br/>
+        <w:t>בעלת בינה יתרה בלב</w:t>
+        <w:br/>
+        <w:t>ובתחושות הפנימיות הצלולות שלה.</w:t>
+        <w:br/>
+        <w:t>יודעת לתת עצות מועילות</w:t>
+        <w:br/>
+        <w:t>ואוהבת להיות בסביבתה.</w:t>
+        <w:br/>
+        <w:t>קיצונית בשימוש בכסף -</w:t>
+        <w:br/>
+        <w:t>בזבזנית גדולה או חסכנית גדולה, בקיצוניות יתרה.</w:t>
+        <w:br/>
+        <w:t>נמשכת לחיי חומר ונהנית מהפירות אותם קוצרת.</w:t>
+        <w:br/>
+        <w:t>אוהבת לעבוד ושונאת ריבים וחיכוכים.</w:t>
+        <w:br/>
+        <w:t>מומלץ לה להקים משפחה בגיל צעיר</w:t>
+        <w:br/>
+        <w:t>ולממש את השליחות שלה מתוכה.</w:t>
+        <w:br/>
+        <w:t>הגיעה כדי ליצור יופי בעולם,</w:t>
+        <w:br/>
+        <w:t>וביכולתה לראות את כל המעלות שבאחרת ובה.</w:t>
+        <w:br/>
+        <w:t>משאירה רושם טוב</w:t>
+        <w:br/>
+        <w:t>ומחברת בין אנשים בצורה טבעית.</w:t>
+        <w:br/>
+        <w:t>אוהבת טבע, מוסיקה, יופי ואומנות</w:t>
+        <w:br/>
+        <w:t>ומתבטאת בעדינות ובנועם.</w:t>
+        <w:br/>
+        <w:br/>
+        <w:t>נקודות לשים לב:</w:t>
+        <w:br/>
+        <w:t>עליה להימנע מנקמנות מיותרת</w:t>
+        <w:br/>
+        <w:t>ולחפש את הרווחים בכל סיטואציה.</w:t>
+        <w:br/>
+        <w:t>זקוקה למשוב חיובי, במיוחד מאמא מגיל צעיר,</w:t>
+        <w:br/>
+        <w:t>ודבר זה משפיע מאוד על התפתחותה האישית.</w:t>
+        <w:br/>
+        <w:t>הגברים (שבייעוד 6) רגישים מאוד</w:t>
+        <w:br/>
+        <w:t>ועליה לספק להם רגש רב בבית,</w:t>
+        <w:br/>
+        <w:t>ולא להם לחפש בחוץ.</w:t>
+        <w:br/>
+        <w:t>השיעור הגדול הוא באהבה מבלי תנאים.</w:t>
+        <w:br/>
+        <w:br/>
+        <w:t>עיסוקים מומלצים:</w:t>
+        <w:br/>
+        <w:t>שירות לציבור בפן הרגשי, אמנות, אנשים, הדרכה.</w:t>
+        <w:br/>
+        <w:t>רפואה, עו"ס, סיעוד.</w:t>
+        <w:br/>
+        <w:t>עמותות, עיריות, משרדי ממשלה, צדק ומשפט.</w:t>
+        <w:br/>
+        <w:t>תמיכה טכנית, שירות לקוחות.</w:t>
+        <w:br/>
+        <w:t>הדרכה רוחנית.</w:t>
+        <w:br/>
+        <w:t>פטנטים והמצאות, מקוריות, אמנות.</w:t>
+        <w:br/>
+        <w:t>עבודה עם נשים/ילדים - אופנה, ביגוד,</w:t>
+        <w:br/>
+        <w:t>עסק משפחתי, עסק מהבית.</w:t>
+      </w:r>
+    </w:p>
+    <w:p>
+      <w:pPr>
+        <w:jc w:val="right"/>
+      </w:pPr>
+    </w:p>
+    <w:p>
+      <w:pPr>
+        <w:pStyle w:val="Heading1"/>
+        <w:jc w:val="right"/>
+      </w:pPr>
+      <w:r>
+        <w:t>יום לידה (לועזי)</w:t>
+      </w:r>
+    </w:p>
+    <w:p>
+      <w:pPr>
+        <w:jc w:val="right"/>
+      </w:pPr>
+      <w:r>
+        <w:t>יום הלידה המקורי: 14, לאחר צמצום: 5</w:t>
+      </w:r>
+    </w:p>
+    <w:p>
+      <w:pPr>
+        <w:jc w:val="right"/>
+      </w:pPr>
+      <w:r>
+        <w:t>פרשנות ליום הלידה 14:</w:t>
+        <w:br/>
+        <w:t>﻿מגיבה במהירות, עושה מה שהיא רוצה,</w:t>
+        <w:br/>
+        <w:t>פורצת מסגרות, זקוקה לשינויים וגיוונים</w:t>
+        <w:br/>
+        <w:t>ויש לה קושי להגיע לאיזון עקב הקיצוניות שלה.</w:t>
+        <w:br/>
+        <w:t>יוצרת מתח בכל מקום אליו מגיעה,</w:t>
+        <w:br/>
+        <w:t>נמשכת אל החדש והמקורי</w:t>
+        <w:br/>
+        <w:t>אולם בסופו של דבר מחפשת את היציבות</w:t>
+        <w:br/>
+        <w:t>והקרקע שמספקים לה הצלחה.</w:t>
+        <w:br/>
+        <w:t>יציאה לטיולים ולטבע טובים לה,</w:t>
+        <w:br/>
+        <w:t>ספורט ותנועה.</w:t>
+        <w:br/>
+        <w:t>מומלץ לשמור על שגרה</w:t>
+        <w:br/>
+        <w:t>ובתוכה לבצע שינויים.</w:t>
+        <w:br/>
+        <w:t>בעלת מוסר עבודה גבוה,</w:t>
+        <w:br/>
+        <w:t>אך אם תשתעמם במסגרת</w:t>
+        <w:br/>
+        <w:t>מסוגלת לפרוץ אותה.</w:t>
+      </w:r>
+    </w:p>
+    <w:p>
+      <w:pPr>
+        <w:jc w:val="right"/>
+      </w:pPr>
+      <w:r>
+        <w:t>פרשנות ליום הלידה המצומצם 5:</w:t>
+        <w:br/>
+        <w:t>﻿תקשורתית וזקוקה לאנשים.</w:t>
+        <w:br/>
+        <w:t>כלפי חוץ מפגינה כריזמה,</w:t>
+        <w:br/>
+        <w:t>סקרנות, חברמניות והתלהבות.</w:t>
+        <w:br/>
+        <w:t>רעיונות בלתי פוסקים ויכולות</w:t>
+        <w:br/>
+        <w:t>אינטלקטואליות מפותחות.</w:t>
+        <w:br/>
+        <w:t>רצון להחליף עיסוקים</w:t>
+        <w:br/>
+        <w:t>או להמציא את עצמה מחדש מפעם לפעם.</w:t>
+        <w:br/>
+        <w:t>עבודה בסביבה של קהל צעיר</w:t>
+        <w:br/>
+        <w:t>ומשתנה מאוד טובה לה.</w:t>
+        <w:br/>
+        <w:t>בעלת הופעה מרשימה</w:t>
+        <w:br/>
+        <w:t>והיא משמשת כמגנט להמונים.</w:t>
+        <w:br/>
+        <w:t>טובה בהעברת ידע</w:t>
+        <w:br/>
+        <w:t>ועליה להפגין ביטחון בעצמה.</w:t>
+        <w:br/>
+        <w:t>מומלץ לה להכניס אקשן ותנועה</w:t>
+        <w:br/>
+        <w:t>שוטפת בסביבת עבודתה ולהתרחק</w:t>
+        <w:br/>
+        <w:t>כמו מאש ממשרדים שגרתיים</w:t>
+        <w:br/>
+        <w:t>שגורמים לה לנבול ולסבול.</w:t>
+        <w:br/>
+        <w:br/>
+        <w:t>עיסוקים מתאימים - על פי יום לידה 5:</w:t>
+        <w:br/>
+        <w:t>מחשבים, תקשורת</w:t>
+        <w:br/>
+        <w:t>במה, פרסום, יחסי ציבור</w:t>
+        <w:br/>
+        <w:t>מכירות, הוראה ואימון</w:t>
+        <w:br/>
+        <w:t>פוליטיקה, תרגום, כתיבה</w:t>
+        <w:br/>
+        <w:t>תיירות ונופש, נהגת, ספורט, חו"ל</w:t>
+      </w:r>
+    </w:p>
+    <w:p>
+      <w:pPr>
+        <w:jc w:val="right"/>
+      </w:pPr>
+    </w:p>
+    <w:p>
+      <w:pPr>
+        <w:pStyle w:val="Heading1"/>
+        <w:jc w:val="right"/>
+      </w:pPr>
+      <w:r>
+        <w:t>חודש לידה (לועזי)</w:t>
+      </w:r>
+    </w:p>
+    <w:p>
+      <w:pPr>
+        <w:jc w:val="right"/>
+      </w:pPr>
+      <w:r>
+        <w:t>חודש הלידה המקורי: 4, לאחר צמצום: 4</w:t>
+      </w:r>
+    </w:p>
+    <w:p>
+      <w:pPr>
+        <w:jc w:val="right"/>
+      </w:pPr>
+      <w:r>
+        <w:t>﻿חודש לידה 4:</w:t>
+        <w:br/>
+        <w:t>מניפולציות, שקרים,</w:t>
+        <w:br/>
+        <w:t>חוסר איזון ויציבות.</w:t>
+        <w:br/>
+        <w:t>ביקורתיות יתר ופרפקציוניזם</w:t>
+        <w:br/>
+        <w:t>מוחלט כלפי הצד השני ועצמה.</w:t>
+      </w:r>
+    </w:p>
+    <w:p>
+      <w:pPr>
+        <w:jc w:val="right"/>
+      </w:pPr>
+    </w:p>
+    <w:p>
+      <w:pPr>
+        <w:pStyle w:val="Heading1"/>
+        <w:jc w:val="right"/>
+      </w:pPr>
+      <w:r>
+        <w:t>מספר השם הפרטי</w:t>
+      </w:r>
+    </w:p>
+    <w:p>
+      <w:pPr>
+        <w:jc w:val="right"/>
+      </w:pPr>
+      <w:r>
+        <w:t>השם: רומי, הערך הנומרולוגי: 4</w:t>
+      </w:r>
+    </w:p>
+    <w:p>
+      <w:pPr>
+        <w:jc w:val="right"/>
+      </w:pPr>
+    </w:p>
+    <w:p>
+      <w:pPr>
+        <w:pStyle w:val="Heading1"/>
+        <w:jc w:val="right"/>
+      </w:pPr>
+      <w:r>
+        <w:t>מספר השם המלא (שאיפת האדם)</w:t>
+      </w:r>
+    </w:p>
+    <w:p>
+      <w:pPr>
+        <w:jc w:val="right"/>
+      </w:pPr>
+      <w:r>
+        <w:t>השם המלא: רומי פישמן, הערך הנומרולוגי: 7</w:t>
+      </w:r>
+    </w:p>
+    <w:p>
+      <w:pPr>
+        <w:jc w:val="right"/>
+      </w:pPr>
+      <w:r>
+        <w:t>[קובץ פרשנות לא נמצא: D:\pycharm\projects\NumerologyReportGenerator\interpretations\women\interpretations\human_aspiration\7_f.txt]</w:t>
+      </w:r>
+    </w:p>
+    <w:p>
+      <w:pPr>
+        <w:jc w:val="right"/>
+      </w:pPr>
+    </w:p>
+    <w:p>
+      <w:pPr>
+        <w:pStyle w:val="Heading1"/>
+        <w:jc w:val="right"/>
+      </w:pPr>
+      <w:r>
+        <w:t>מספר העיצורים (האישיות החיצונית)</w:t>
+      </w:r>
+    </w:p>
+    <w:p>
+      <w:pPr>
+        <w:jc w:val="right"/>
+      </w:pPr>
+      <w:r>
+        <w:t>הערך הנומרולוגי: 8</w:t>
+      </w:r>
+    </w:p>
+    <w:p>
+      <w:pPr>
+        <w:jc w:val="right"/>
+      </w:pPr>
+      <w:r>
+        <w:t>﻿משדרת כוח ובגרות,</w:t>
+        <w:br/>
+        <w:t>אישה שאפשר לשים את כל הקופה בכיסה.</w:t>
+        <w:br/>
+        <w:t>נראית מוצלחת גם בעת משבר,</w:t>
+        <w:br/>
+        <w:t>לא מפגינה חולשה ומאוד חשוב לה</w:t>
+        <w:br/>
+        <w:t>להשאיר רושם של יציבות וכוח.</w:t>
+        <w:br/>
+        <w:t>אוהבת לייעץ והופעתה החיצונית</w:t>
+        <w:br/>
+        <w:t>תמיד מוקפדת.</w:t>
+        <w:br/>
+        <w:t>בטוחה שצודקת, אקטיבית,</w:t>
+        <w:br/>
+        <w:t>תזזיתית ולעיתים עקשנית מדי.</w:t>
+        <w:br/>
+        <w:t>עליה לשים לב לא לדרוך על אחרות</w:t>
+        <w:br/>
+        <w:t>ולפעול מתוך כבוד לזולת ולרוח.</w:t>
+        <w:br/>
+        <w:t>הסביבה רואה אותה כאישה שאוהבת שליטה.</w:t>
+      </w:r>
+    </w:p>
+    <w:p>
+      <w:pPr>
+        <w:jc w:val="right"/>
+      </w:pPr>
+    </w:p>
+    <w:p>
+      <w:pPr>
+        <w:pStyle w:val="Heading1"/>
+        <w:jc w:val="right"/>
+      </w:pPr>
+      <w:r>
+        <w:t>מספר התנועות (הנשמה / הרצון הפנימי)</w:t>
+      </w:r>
+    </w:p>
+    <w:p>
+      <w:pPr>
+        <w:jc w:val="right"/>
+      </w:pPr>
+      <w:r>
+        <w:t>הערך הנומרולוגי: 8</w:t>
+      </w:r>
+    </w:p>
+    <w:p>
+      <w:pPr>
+        <w:jc w:val="right"/>
+      </w:pPr>
+      <w:r>
+        <w:t>[קובץ פרשנות לא נמצא: D:\pycharm\projects\NumerologyReportGenerator\interpretations\women\vowels\8_f.txt]</w:t>
+      </w:r>
+    </w:p>
+    <w:p>
+      <w:pPr>
+        <w:jc w:val="right"/>
+      </w:pPr>
+    </w:p>
+    <w:p>
+      <w:pPr>
+        <w:pStyle w:val="Heading1"/>
+        <w:jc w:val="right"/>
+      </w:pPr>
+      <w:r>
+        <w:t>שנה אישית</w:t>
+      </w:r>
+    </w:p>
+    <w:p>
+      <w:pPr>
+        <w:jc w:val="right"/>
+      </w:pPr>
+      <w:r>
+        <w:t>השנה האישית שלך לשנת 2025 (החל מיום ההולדת שלך בשנה זו): 9</w:t>
+      </w:r>
+    </w:p>
+    <w:p>
+      <w:pPr>
+        <w:jc w:val="right"/>
+      </w:pPr>
+      <w:r>
+        <w:t>﻿שנת סיומים וסגירת מעגל.</w:t>
+        <w:br/>
+        <w:t>בשנה זו - כל מה שלא משרת אותך</w:t>
+        <w:br/>
+        <w:t>ייפרד מחייך.</w:t>
+        <w:br/>
+        <w:br/>
+        <w:t>קשרים זוגיים הרסניים,</w:t>
+        <w:br/>
+        <w:t>עבודה לא מוצלחת תסתיים</w:t>
+        <w:br/>
+        <w:t>וזהו זמן טוב לנסוע לחו"ל ולהרגיש עולם.</w:t>
+        <w:br/>
+        <w:t>שנה של התנסויות ויש לזרום איתן</w:t>
+        <w:br/>
+        <w:t>לטובת התחלות חדשות שיחלו בשנה הבאה.</w:t>
+        <w:br/>
+        <w:br/>
+        <w:t>בשנה זו תחווי התלבטויות רבות,</w:t>
+        <w:br/>
+        <w:t>אל תחששי מהן אלא ראי את היתרונות</w:t>
+        <w:br/>
+        <w:t>בכל הזדמנות ותכנני את צעדייך לשנה הבאה.</w:t>
+        <w:br/>
+        <w:t>חובות וזכויות ייפרעו</w:t>
+        <w:br/>
+        <w:t>וכן כל מה שלא הושלם</w:t>
+        <w:br/>
+        <w:t>יעלה ויצוף על הפרק.</w:t>
+        <w:br/>
+        <w:br/>
+        <w:t>תחושה של רגישות</w:t>
+        <w:br/>
+        <w:t>יחד עם אינטואיציה מפותחת.</w:t>
+        <w:br/>
+        <w:t>שימי לב למתרחש סביבך</w:t>
+        <w:br/>
+        <w:t>והיי דרוכה ומוכנה</w:t>
+        <w:br/>
+        <w:t>לתכנן את צעדייך למחזור הבא.</w:t>
+      </w:r>
+    </w:p>
+    <w:p>
+      <w:pPr>
+        <w:jc w:val="right"/>
+      </w:pPr>
+    </w:p>
+    <w:p>
+      <w:pPr>
+        <w:pStyle w:val="Heading1"/>
+        <w:jc w:val="right"/>
+      </w:pPr>
+      <w:r>
+        <w:t>שנה נסתרת (פוטנציאל שנתי)</w:t>
+      </w:r>
+    </w:p>
+    <w:p>
+      <w:pPr>
+        <w:jc w:val="right"/>
+      </w:pPr>
+      <w:r>
+        <w:t>השנה הנסתרת שלך: 9/6</w:t>
+      </w:r>
+    </w:p>
+    <w:p>
+      <w:pPr>
+        <w:jc w:val="right"/>
+      </w:pPr>
+      <w:r>
+        <w:t>[קובץ פרשנות לא נמצא: D:\pycharm\projects\NumerologyReportGenerator\interpretations\women\hidden_year\9_6_f.txt]</w:t>
+      </w:r>
+    </w:p>
+    <w:p>
+      <w:pPr>
+        <w:jc w:val="right"/>
+      </w:pPr>
+    </w:p>
+    <w:p>
+      <w:pPr>
+        <w:pStyle w:val="Heading1"/>
+        <w:jc w:val="right"/>
+      </w:pPr>
+      <w:r>
+        <w:t>רבעונים אישיים לפי מיכל גרין</w:t>
+      </w:r>
+    </w:p>
+    <w:p>
+      <w:pPr>
+        <w:jc w:val="right"/>
+      </w:pPr>
+      <w:r>
+        <w:t>רבעון ראשון: 6</w:t>
+      </w:r>
+    </w:p>
+    <w:p>
+      <w:pPr>
+        <w:jc w:val="right"/>
+      </w:pPr>
+      <w:r>
+        <w:t>[קובץ פרשנות לא נמצא: D:\pycharm\projects\NumerologyReportGenerator\interpretations\women\quarters\6_f.txt]</w:t>
+      </w:r>
+    </w:p>
+    <w:p>
+      <w:pPr>
+        <w:jc w:val="right"/>
+      </w:pPr>
+      <w:r>
+        <w:t>רבעון שני: 6</w:t>
+      </w:r>
+    </w:p>
+    <w:p>
+      <w:pPr>
+        <w:jc w:val="right"/>
+      </w:pPr>
+      <w:r>
+        <w:t>[קובץ פרשנות לא נמצא: D:\pycharm\projects\NumerologyReportGenerator\interpretations\women\quarters\6_f.txt]</w:t>
+      </w:r>
+    </w:p>
+    <w:p>
+      <w:pPr>
+        <w:jc w:val="right"/>
+      </w:pPr>
+      <w:r>
+        <w:t>רבעון שלישי: 3</w:t>
+      </w:r>
+    </w:p>
+    <w:p>
+      <w:pPr>
+        <w:jc w:val="right"/>
+      </w:pPr>
+      <w:r>
+        <w:t>[קובץ פרשנות לא נמצא: D:\pycharm\projects\NumerologyReportGenerator\interpretations\women\quarters\3_f.txt]</w:t>
+      </w:r>
+    </w:p>
+    <w:p>
+      <w:pPr>
+        <w:jc w:val="right"/>
+      </w:pPr>
+      <w:r>
+        <w:t>רבעון רביעי: 9</w:t>
+      </w:r>
+    </w:p>
+    <w:p>
+      <w:pPr>
+        <w:jc w:val="right"/>
+      </w:pPr>
+      <w:r>
+        <w:t>[קובץ פרשנות לא נמצא: D:\pycharm\projects\NumerologyReportGenerator\interpretations\women\quarters\9_f.txt]</w:t>
+      </w:r>
+    </w:p>
+    <w:p>
+      <w:pPr>
+        <w:jc w:val="right"/>
+      </w:pPr>
+    </w:p>
+    <w:p>
+      <w:pPr>
+        <w:jc w:val="right"/>
+      </w:pPr>
+      <w:r>
+        <w:t>רצפים של 2 ספרות בין הרבעונים: 66, 63, 39</w:t>
+      </w:r>
+    </w:p>
+    <w:p>
+      <w:pPr>
+        <w:jc w:val="right"/>
+      </w:pPr>
+      <w:r>
+        <w:t>רצפים של 3 ספרות בין הרבעונים: 663, 639</w:t>
+      </w:r>
+    </w:p>
+    <w:p>
+      <w:pPr>
+        <w:pStyle w:val="Heading1"/>
+        <w:jc w:val="right"/>
+      </w:pPr>
+      <w:r>
+        <w:t>פסגות, אתגרים ושילובם</w:t>
+      </w:r>
+    </w:p>
+    <w:p>
+      <w:pPr>
+        <w:pStyle w:val="Heading2"/>
+        <w:jc w:val="right"/>
+      </w:pPr>
+      <w:r>
+        <w:t>תקופה ראשונה (מגיל לידה עד גיל 21)</w:t>
+      </w:r>
+    </w:p>
+    <w:p>
+      <w:pPr>
+        <w:jc w:val="right"/>
+      </w:pPr>
+      <w:r>
+        <w:t>פסגה: 9</w:t>
+      </w:r>
+    </w:p>
+    <w:p>
+      <w:pPr>
+        <w:jc w:val="right"/>
+      </w:pPr>
+      <w:r>
+        <w:t>﻿רצון להשפיע ולתת השראה לאנושות</w:t>
+        <w:br/>
+        <w:t>דרך אמצעים שונים.</w:t>
+        <w:br/>
+        <w:t>אפשרות למשברים אישיים</w:t>
+        <w:br/>
+        <w:t>על מנת ללמוד מהו שחרור</w:t>
+        <w:br/>
+        <w:t>וכדי להבין שכל סיום הוא התחלה חדשה.</w:t>
+        <w:br/>
+        <w:t>נדרש ריפוי אישי ויכולת לצמוח.</w:t>
+        <w:br/>
+        <w:br/>
+        <w:t>* כפסגה ראשונה:</w:t>
+        <w:br/>
+        <w:t>התפתחות אמונות ופרינציפים,</w:t>
+        <w:br/>
+        <w:t>שעלולים להיות כרועץ בהמשך החיים.</w:t>
+        <w:br/>
+        <w:t>צורך ללמוד מהי הזהות האישית שלך</w:t>
+        <w:br/>
+        <w:t>ומה את אוהבת בעצמך</w:t>
+        <w:br/>
+        <w:t>על מנת להוות מקור השפעה בהמשך.</w:t>
+        <w:br/>
+        <w:br/>
+        <w:t>* כפסגה שנייה או שלישית:</w:t>
+        <w:br/>
+        <w:t>משברים אישיים מעודדים צמיחה.</w:t>
+        <w:br/>
+        <w:t>הרבה צמתים שבהם יהיה צורך</w:t>
+        <w:br/>
+        <w:t>להחליט לצעוד קדימה ולשחרר את העבר.</w:t>
+        <w:br/>
+        <w:t>יכולת להשפיע ולהוות השראה.</w:t>
+        <w:br/>
+        <w:br/>
+        <w:t>* כפסגה רביעית:</w:t>
+        <w:br/>
+        <w:t>יכולת להיות מורה, מדריכה,</w:t>
+        <w:br/>
+        <w:t>מרצה או מנטורית לחיים.</w:t>
+        <w:br/>
+        <w:t>הרבה תובנות שראוי להעביר הלאה.</w:t>
+      </w:r>
+    </w:p>
+    <w:p>
+      <w:pPr>
+        <w:jc w:val="right"/>
+      </w:pPr>
+      <w:r>
+        <w:t>אתגר: 1</w:t>
+      </w:r>
+    </w:p>
+    <w:p>
+      <w:pPr>
+        <w:jc w:val="right"/>
+      </w:pPr>
+      <w:r>
+        <w:t>﻿נראית כלפי חוץ סמכותית,</w:t>
+        <w:br/>
+        <w:t>עם חזות מרשימה מאוד,</w:t>
+        <w:br/>
+        <w:t>בטוחה בעצמה ואנשים סומכים עליה</w:t>
+        <w:br/>
+        <w:t>שתדע לעשות את המעשה הנכון בזמן הנכון.</w:t>
+        <w:br/>
+        <w:t>חסרת סבלנות כאשר לא מסכימים עם דעתה,</w:t>
+        <w:br/>
+        <w:t>אוהבת לבלוט ושואפת לעצמאות ולניהול.</w:t>
+        <w:br/>
+        <w:t>בתחום התעסוקתי היא צריכה מרחב</w:t>
+        <w:br/>
+        <w:t>ואוהבת לנהל ולהוביל.</w:t>
+      </w:r>
+    </w:p>
+    <w:p>
+      <w:pPr>
+        <w:jc w:val="right"/>
+      </w:pPr>
+      <w:r>
+        <w:t>שילוב פסגה-אתגר (91):</w:t>
+      </w:r>
+    </w:p>
+    <w:p>
+      <w:pPr>
+        <w:jc w:val="right"/>
+      </w:pPr>
+      <w:r>
+        <w:t>﻿חשיבה קיצונית.</w:t>
+        <w:br/>
+        <w:t>אם מופיעה כפסגה ראשונה</w:t>
+        <w:br/>
+        <w:t>יהיה הרצון להוראה או לתחום הניהול,</w:t>
+        <w:br/>
+        <w:t>הדרכה.</w:t>
+        <w:br/>
+        <w:t>פרידה משמעותית (זוגיות),</w:t>
+        <w:br/>
+        <w:t>עצמאות, יכולת וורבלית,</w:t>
+        <w:br/>
+        <w:t>מנהלת מכירות.</w:t>
+      </w:r>
+    </w:p>
+    <w:p>
+      <w:pPr>
+        <w:jc w:val="right"/>
+      </w:pPr>
+    </w:p>
+    <w:p>
+      <w:pPr>
+        <w:pStyle w:val="Heading2"/>
+        <w:jc w:val="right"/>
+      </w:pPr>
+      <w:r>
+        <w:t>תקופה שנייה (מגיל 22 עד גיל 29)</w:t>
+      </w:r>
+    </w:p>
+    <w:p>
+      <w:pPr>
+        <w:jc w:val="right"/>
+      </w:pPr>
+      <w:r>
+        <w:t>פסגה: 2</w:t>
+      </w:r>
+    </w:p>
+    <w:p>
+      <w:pPr>
+        <w:jc w:val="right"/>
+      </w:pPr>
+      <w:r>
+        <w:t>﻿צורך ללמוד לעבוד בשיתוף פעולה</w:t>
+        <w:br/>
+        <w:t>בכל הרמות (אישית, מקצועית וחברתית).</w:t>
+        <w:br/>
+        <w:t>נדרשת סבלנות, הגינות ואיזון</w:t>
+        <w:br/>
+        <w:t>לכל אורך הפסגה.</w:t>
+        <w:br/>
+        <w:t>לרוב הסביבתיות תהיה קשורה בטיפול</w:t>
+        <w:br/>
+        <w:t>ומצבים בין-אישיים רגישים,</w:t>
+        <w:br/>
+        <w:t>והחוכמה תהיה לפתח גישה מתונה ופשרנית</w:t>
+        <w:br/>
+        <w:t>בלי להיהפך לקורבן.</w:t>
+        <w:br/>
+        <w:br/>
+        <w:t>* כפסגה ראשונה:</w:t>
+        <w:br/>
+        <w:t>ירושה שמגיעה מהבית</w:t>
+        <w:br/>
+        <w:t>(כספית, אישית, תכונתית או הרגלים).</w:t>
+        <w:br/>
+        <w:t>קיימת רגישות שטובה לעבודה</w:t>
+        <w:br/>
+        <w:t>בכל הקשור בטיפול,</w:t>
+        <w:br/>
+        <w:t>אך יש צורך להיזהר לא להפוך</w:t>
+        <w:br/>
+        <w:t>לאישיות תלותית וקורבנית.</w:t>
+        <w:br/>
+        <w:br/>
+        <w:t>* כפסגה שנייה או שלישית:</w:t>
+        <w:br/>
+        <w:t>נדרש איזון וצורך בחלוקה הגיונית</w:t>
+        <w:br/>
+        <w:t>בין הבית והחיים האישיים</w:t>
+        <w:br/>
+        <w:t>לבין החוץ והחיים המקצועיים.</w:t>
+        <w:br/>
+        <w:t>תהיי חייבת להתאים את עצמך</w:t>
+        <w:br/>
+        <w:t>לעבודת צוות.</w:t>
+        <w:br/>
+        <w:br/>
+        <w:t>* כפסגה רביעית:</w:t>
+        <w:br/>
+        <w:t>דגש על ענייני זוגיות ומשפחתיות.</w:t>
+        <w:br/>
+        <w:t>תשומת לב נדרשת לא לחיות בעבר</w:t>
+        <w:br/>
+        <w:t>ולהישען על זיכרונות.</w:t>
+        <w:br/>
+        <w:t>ההווה כאן מונח לצידך.</w:t>
+      </w:r>
+    </w:p>
+    <w:p>
+      <w:pPr>
+        <w:jc w:val="right"/>
+      </w:pPr>
+      <w:r>
+        <w:t>אתגר: 1</w:t>
+      </w:r>
+    </w:p>
+    <w:p>
+      <w:pPr>
+        <w:jc w:val="right"/>
+      </w:pPr>
+      <w:r>
+        <w:t>﻿נראית כלפי חוץ סמכותית,</w:t>
+        <w:br/>
+        <w:t>עם חזות מרשימה מאוד,</w:t>
+        <w:br/>
+        <w:t>בטוחה בעצמה ואנשים סומכים עליה</w:t>
+        <w:br/>
+        <w:t>שתדע לעשות את המעשה הנכון בזמן הנכון.</w:t>
+        <w:br/>
+        <w:t>חסרת סבלנות כאשר לא מסכימים עם דעתה,</w:t>
+        <w:br/>
+        <w:t>אוהבת לבלוט ושואפת לעצמאות ולניהול.</w:t>
+        <w:br/>
+        <w:t>בתחום התעסוקתי היא צריכה מרחב</w:t>
+        <w:br/>
+        <w:t>ואוהבת לנהל ולהוביל.</w:t>
+      </w:r>
+    </w:p>
+    <w:p>
+      <w:pPr>
+        <w:jc w:val="right"/>
+      </w:pPr>
+      <w:r>
+        <w:t>שילוב פסגה-אתגר (21):</w:t>
+      </w:r>
+    </w:p>
+    <w:p>
+      <w:pPr>
+        <w:jc w:val="right"/>
+      </w:pPr>
+      <w:r>
+        <w:t>﻿התחלות חדשות בזוגיות ובמשפחה.</w:t>
+        <w:br/>
+        <w:t>כמות ילדים מומלצת:</w:t>
+        <w:br/>
+        <w:t>שניים ממין אחד והשלישי ממין אחר,</w:t>
+        <w:br/>
+        <w:t>שני ילדים מינימום.</w:t>
+        <w:br/>
+        <w:t>אצל אישה, פסגה שלישית 2-1</w:t>
+        <w:br/>
+        <w:t>יכולה להעיד על שינוי בעיסוק או בזוגיות.</w:t>
+        <w:br/>
+        <w:t>התחלות חדשות ועצמאות עסקית</w:t>
+        <w:br/>
+        <w:t>יובילו להתחלות חדשות בזוגיות,</w:t>
+        <w:br/>
+        <w:t>הולדה ופריון.</w:t>
+        <w:br/>
+        <w:t>עבודה עם נשים או ילדים או ציבור</w:t>
+        <w:br/>
+        <w:t>במקומות שעוזרים לאנשים לפתור בעיות.</w:t>
+      </w:r>
+    </w:p>
+    <w:p>
+      <w:pPr>
+        <w:jc w:val="right"/>
+      </w:pPr>
+    </w:p>
+    <w:p>
+      <w:pPr>
+        <w:pStyle w:val="Heading2"/>
+        <w:jc w:val="right"/>
+      </w:pPr>
+      <w:r>
+        <w:t>תקופה שלישית (מגיל 30 עד גיל 38)</w:t>
+      </w:r>
+    </w:p>
+    <w:p>
+      <w:pPr>
+        <w:jc w:val="right"/>
+      </w:pPr>
+      <w:r>
+        <w:t>פסגה: 2</w:t>
+      </w:r>
+    </w:p>
+    <w:p>
+      <w:pPr>
+        <w:jc w:val="right"/>
+      </w:pPr>
+      <w:r>
+        <w:t>﻿צורך ללמוד לעבוד בשיתוף פעולה</w:t>
+        <w:br/>
+        <w:t>בכל הרמות (אישית, מקצועית וחברתית).</w:t>
+        <w:br/>
+        <w:t>נדרשת סבלנות, הגינות ואיזון</w:t>
+        <w:br/>
+        <w:t>לכל אורך הפסגה.</w:t>
+        <w:br/>
+        <w:t>לרוב הסביבתיות תהיה קשורה בטיפול</w:t>
+        <w:br/>
+        <w:t>ומצבים בין-אישיים רגישים,</w:t>
+        <w:br/>
+        <w:t>והחוכמה תהיה לפתח גישה מתונה ופשרנית</w:t>
+        <w:br/>
+        <w:t>בלי להיהפך לקורבן.</w:t>
+        <w:br/>
+        <w:br/>
+        <w:t>* כפסגה ראשונה:</w:t>
+        <w:br/>
+        <w:t>ירושה שמגיעה מהבית</w:t>
+        <w:br/>
+        <w:t>(כספית, אישית, תכונתית או הרגלים).</w:t>
+        <w:br/>
+        <w:t>קיימת רגישות שטובה לעבודה</w:t>
+        <w:br/>
+        <w:t>בכל הקשור בטיפול,</w:t>
+        <w:br/>
+        <w:t>אך יש צורך להיזהר לא להפוך</w:t>
+        <w:br/>
+        <w:t>לאישיות תלותית וקורבנית.</w:t>
+        <w:br/>
+        <w:br/>
+        <w:t>* כפסגה שנייה או שלישית:</w:t>
+        <w:br/>
+        <w:t>נדרש איזון וצורך בחלוקה הגיונית</w:t>
+        <w:br/>
+        <w:t>בין הבית והחיים האישיים</w:t>
+        <w:br/>
+        <w:t>לבין החוץ והחיים המקצועיים.</w:t>
+        <w:br/>
+        <w:t>תהיי חייבת להתאים את עצמך</w:t>
+        <w:br/>
+        <w:t>לעבודת צוות.</w:t>
+        <w:br/>
+        <w:br/>
+        <w:t>* כפסגה רביעית:</w:t>
+        <w:br/>
+        <w:t>דגש על ענייני זוגיות ומשפחתיות.</w:t>
+        <w:br/>
+        <w:t>תשומת לב נדרשת לא לחיות בעבר</w:t>
+        <w:br/>
+        <w:t>ולהישען על זיכרונות.</w:t>
+        <w:br/>
+        <w:t>ההווה כאן מונח לצידך.</w:t>
+      </w:r>
+    </w:p>
+    <w:p>
+      <w:pPr>
+        <w:jc w:val="right"/>
+      </w:pPr>
+      <w:r>
+        <w:t>אתגר: 0</w:t>
+      </w:r>
+    </w:p>
+    <w:p>
+      <w:pPr>
+        <w:jc w:val="right"/>
+      </w:pPr>
+      <w:r>
+        <w:t>﻿כל האפשרויות פתוחות בפניה</w:t>
+        <w:br/>
+        <w:t>למימוש הפסגה.</w:t>
+        <w:br/>
+        <w:t>יתכן קושי במימוש הפסגה,</w:t>
+        <w:br/>
+        <w:t>כאשר האתגר הוא 0.</w:t>
+        <w:br/>
+        <w:t>יש לשים לב לאתגרים הנוספים</w:t>
+        <w:br/>
+        <w:t>במפה ולכוון את האדם</w:t>
+        <w:br/>
+        <w:t>לפי המספר הדומיננטי ביותר מביניהם.</w:t>
+      </w:r>
+    </w:p>
+    <w:p>
+      <w:pPr>
+        <w:jc w:val="right"/>
+      </w:pPr>
+      <w:r>
+        <w:t>שילוב פסגה-אתגר (20):</w:t>
+      </w:r>
+    </w:p>
+    <w:p>
+      <w:pPr>
+        <w:jc w:val="right"/>
+      </w:pPr>
+      <w:r>
+        <w:t>﻿כל האפשרויות פתוחות</w:t>
+        <w:br/>
+        <w:t>לנושאי פסגה 2.</w:t>
+        <w:br/>
+        <w:t>קושי עם פריון,</w:t>
+        <w:br/>
+        <w:t>או קושי עם דמות נקבית במשפחה,</w:t>
+        <w:br/>
+        <w:t>קושי בזוגיות, רגישות גניקולוגית.</w:t>
+        <w:br/>
+        <w:t>2 עיסוקים אפשריים פה.</w:t>
+        <w:br/>
+        <w:t>בעיות כלכליות אפשריות</w:t>
+        <w:br/>
+        <w:t>אם לא עובדות בשיתוף פעולה</w:t>
+        <w:br/>
+        <w:t>או בעזרה לאנשים, נשים או ילדים.</w:t>
+        <w:br/>
+        <w:t>מומלץ להיות בסביבה נשית,</w:t>
+        <w:br/>
+        <w:t>ציבורית או ילדים</w:t>
+        <w:br/>
+        <w:t>כדי לממש את התדר הזה</w:t>
+        <w:br/>
+        <w:t>בפוטנציאל הגבוה.</w:t>
+        <w:br/>
+        <w:t>(דוגמה: איב סאן לורן עם פסגה שנייה 2-0</w:t>
+        <w:br/>
+        <w:t>הקדיש את ייעודו ועבד בסביבת נשים מובהקת).</w:t>
+      </w:r>
+    </w:p>
+    <w:p>
+      <w:pPr>
+        <w:jc w:val="right"/>
+      </w:pPr>
+    </w:p>
+    <w:p>
+      <w:pPr>
+        <w:pStyle w:val="Heading2"/>
+        <w:jc w:val="right"/>
+      </w:pPr>
+      <w:r>
+        <w:t>תקופה רביעית (מגיל 39 ואילך)</w:t>
+      </w:r>
+    </w:p>
+    <w:p>
+      <w:pPr>
+        <w:jc w:val="right"/>
+      </w:pPr>
+      <w:r>
+        <w:t>פסגה: 1</w:t>
+      </w:r>
+    </w:p>
+    <w:p>
+      <w:pPr>
+        <w:jc w:val="right"/>
+      </w:pPr>
+      <w:r>
+        <w:t>﻿ריכוז בפיתוח עצמאות,</w:t>
+        <w:br/>
+        <w:t>אינדיבידואליות, זהות עצמית.</w:t>
+        <w:br/>
+        <w:t>קיים צורך בפיתוח מומחיות,</w:t>
+        <w:br/>
+        <w:t>יזמות, בקיאות ושליטה.</w:t>
+        <w:br/>
+        <w:t>רצון להנהיג ולשלוט</w:t>
+        <w:br/>
+        <w:t>תוך כיוון אחרות.</w:t>
+        <w:br/>
+        <w:t>צורך בהצלחה והישגיות</w:t>
+        <w:br/>
+        <w:t>גם בעולם החומרי.</w:t>
+        <w:br/>
+        <w:br/>
+        <w:t>* כפסגה ראשונה:</w:t>
+        <w:br/>
+        <w:t>יש בך יכולות ניהול,</w:t>
+        <w:br/>
+        <w:t>מנהיגות ושליטה.</w:t>
+        <w:br/>
+        <w:t>החוכמה תהיה כרגע לוותר</w:t>
+        <w:br/>
+        <w:t>על האגו והמרכוז העצמי</w:t>
+        <w:br/>
+        <w:t>ולנסות ללמוד מניסיונן של אחרות.</w:t>
+        <w:br/>
+        <w:t>כדאי לחקור, לבחון ולטפח</w:t>
+        <w:br/>
+        <w:t>רעיונות ייחודיים וגישות חדישות.</w:t>
+        <w:br/>
+        <w:br/>
+        <w:t>* כפסגה שנייה או שלישית:</w:t>
+        <w:br/>
+        <w:t>תידרשי להוכיח יכולות ניהוליות</w:t>
+        <w:br/>
+        <w:t>או לפתח עצמאות.</w:t>
+        <w:br/>
+        <w:t>לרוב תהיי חייבת לשנות גישה</w:t>
+        <w:br/>
+        <w:t>מפסגה קודמת.</w:t>
+        <w:br/>
+        <w:br/>
+        <w:t>* כפסגה רביעית:</w:t>
+        <w:br/>
+        <w:t>פרץ של אנרגיה יוזמתית</w:t>
+        <w:br/>
+        <w:t>שדוחפת לפעולה.</w:t>
+        <w:br/>
+        <w:t>הישגיות והצלחה לרוב ילוו תקופה זו.</w:t>
+        <w:br/>
+        <w:t>כוחך עדיין במותנייך.</w:t>
+      </w:r>
+    </w:p>
+    <w:p>
+      <w:pPr>
+        <w:jc w:val="right"/>
+      </w:pPr>
+      <w:r>
+        <w:t>אתגר: 2</w:t>
+      </w:r>
+    </w:p>
+    <w:p>
+      <w:pPr>
+        <w:jc w:val="right"/>
+      </w:pPr>
+      <w:r>
+        <w:t>﻿רגישות יתר, פגיעות,</w:t>
+        <w:br/>
+        <w:t>תלותיות רגשית באחרים.</w:t>
+        <w:br/>
+        <w:t>פחד מדחייה ובדידות.</w:t>
+        <w:br/>
+        <w:t>קושי בקבלת החלטות.</w:t>
+        <w:br/>
+        <w:t>עליה לפתח עצמאות רגשית,</w:t>
+        <w:br/>
+        <w:t>ללמוד לסמוך על האינטואיציות שלה,</w:t>
+        <w:br/>
+        <w:t>להציב גבולות בריאים</w:t>
+        <w:br/>
+        <w:t>ולבטא את צרכיה.</w:t>
+        <w:br/>
+        <w:t>טוב לה לשתף פעולה אך לא מתוך ריצוי.</w:t>
+      </w:r>
+    </w:p>
+    <w:p>
+      <w:pPr>
+        <w:jc w:val="right"/>
+      </w:pPr>
+      <w:r>
+        <w:t>שילוב פסגה-אתגר (12):</w:t>
+      </w:r>
+    </w:p>
+    <w:p>
+      <w:pPr>
+        <w:jc w:val="right"/>
+      </w:pPr>
+      <w:r>
+        <w:t>﻿ניהול הקשור בטיפול, ציבור, נשים, ילדים והזנה.</w:t>
+        <w:br/>
+        <w:t>התחלה חדשה בזוגיות/ ילדים ומשפחה.</w:t>
+        <w:br/>
+        <w:t>אברי מין, גניקולוגי,</w:t>
+        <w:br/>
+        <w:t>ניהול בסביבת נשים וילדים, הזנה או רגש.</w:t>
+        <w:br/>
+        <w:t>דוגמאות: מספרה, גן פרטי,</w:t>
+        <w:br/>
+        <w:t>עסק בתחום הטיפוח הנשי.</w:t>
+        <w:br/>
+        <w:t>תפקיד ניהולי כאחות, עובדת סוציאלית</w:t>
+        <w:br/>
+        <w:t>(יש לבחון את הפסגות אחרי כדי לראות המשכיות לתחום).</w:t>
+        <w:br/>
+        <w:t>אפשרי גם תנועתיות וספורט.</w:t>
+        <w:br/>
+        <w:t>סיכוי גבוה ליצירת קשרים לזוגיות</w:t>
+        <w:br/>
+        <w:t>ויש להתייחס גם לפסגה שאחרי.</w:t>
+        <w:br/>
+        <w:t>אם הפסגה שאחרי מבטאת פסגה של זוגיות גם כן,</w:t>
+        <w:br/>
+        <w:t>אז יש בפסגה זו להתמקד בפן המקצועי,</w:t>
+        <w:br/>
+        <w:t>ורק לאחר מכן להתפנות ליצירת זוגיות וקשרים.</w:t>
+      </w:r>
+    </w:p>
+    <w:p>
+      <w:pPr>
+        <w:jc w:val="right"/>
+      </w:pPr>
+    </w:p>
+    <w:p>
+      <w:pPr>
+        <w:pStyle w:val="Heading1"/>
+        <w:jc w:val="right"/>
+      </w:pPr>
+      <w:r>
+        <w:t>ריבוע פיתגורס</w:t>
+      </w:r>
+    </w:p>
+    <w:p>
+      <w:pPr>
+        <w:jc w:val="right"/>
+      </w:pPr>
+      <w:r>
+        <w:t>המספרים המופיעים בתאריך הלידה (ולכן בריבוע):</w:t>
+        <w:br/>
+        <w:t xml:space="preserve">ספרה 1 מופיעה 2 פעמים. ספרה 2 חסרה. ספרה 3 חסרה. </w:t>
+        <w:br/>
+        <w:t xml:space="preserve">ספרה 4 מופיעה 2 פעמים. ספרה 5 חסרה. ספרה 6 מופיעה 1 פעמים. </w:t>
+        <w:br/>
+        <w:t xml:space="preserve">ספרה 7 חסרה. ספרה 8 מופיעה 1 פעמים. ספרה 9 מופיעה 1 פעמים. </w:t>
+        <w:br/>
+        <w:br/>
+      </w:r>
+    </w:p>
+    <w:p>
+      <w:pPr>
+        <w:jc w:val="right"/>
+      </w:pPr>
     </w:p>
     <w:sectPr>
       <w:pgSz w:w="12240" w:h="15840"/>

</xml_diff>